<commit_message>
DID-001 v1.1: align reconciliation with FR-CCR-005
- Section 7 now covers Bronze to Silver as well as Silver to Gold,
  with rejected rows logged to a reject table, not dropped silently
- Corrects v1.0 claim that each Bronze extract maps to exactly one
  Gold row
- Found while drafting TST-001 Section 5
</commit_message>
<xml_diff>
--- a/docs/10-data-integration-design/RetailSphere_DID-001_v1.0.docx
+++ b/docs/10-data-integration-design/RetailSphere_DID-001_v1.0.docx
@@ -377,7 +377,19 @@
                 <w:sz w:val="19"/>
                 <w:szCs w:val="19"/>
               </w:rPr>
-              <w:t>1.0</w:t>
+              <w:t>1.</w:t>
+            </w:r>
+            <w:r>
+              <w:rPr>
+                <w:rFonts w:ascii="Calibri" w:hAnsi="Calibri" w:cs="Calibri"/>
+                <w:b/>
+                <w:bCs/>
+                <w:color w:val="166534"/>
+                <w:spacing w:val="30"/>
+                <w:sz w:val="19"/>
+                <w:szCs w:val="19"/>
+              </w:rPr>
+              <w:t>1</w:t>
             </w:r>
             <w:r>
               <w:rPr>
@@ -1083,7 +1095,23 @@
           <w:rFonts w:ascii="Calibri" w:hAnsi="Calibri" w:cs="Calibri"/>
           <w:color w:val="1A1A1A"/>
         </w:rPr>
-        <w:t>This document defines the pipeline architecture pattern for ingesting, transforming, and loading data across RetailSphere's Bronze, Silver, and Gold layers, operationalizing the orchestration tool decision made in ADR-005 (Azure Data Factory). It is intended for engineers building the pipelines in Steps 13–16, and satisfies the reconciliation, error handling, data quality, and POPIA propagation requirements defined in FRD-001 (FR-CCR-005 through FR-CCR-008).</w:t>
+        <w:t xml:space="preserve">This document defines the pipeline architecture pattern for ingesting, transforming, and loading data across RetailSphere's Bronze, Silver, and </w:t>
+      </w:r>
+      <w:proofErr w:type="gramStart"/>
+      <w:r>
+        <w:rPr>
+          <w:rFonts w:ascii="Calibri" w:hAnsi="Calibri" w:cs="Calibri"/>
+          <w:color w:val="1A1A1A"/>
+        </w:rPr>
+        <w:t>Gold</w:t>
+      </w:r>
+      <w:proofErr w:type="gramEnd"/>
+      <w:r>
+        <w:rPr>
+          <w:rFonts w:ascii="Calibri" w:hAnsi="Calibri" w:cs="Calibri"/>
+          <w:color w:val="1A1A1A"/>
+        </w:rPr>
+        <w:t xml:space="preserve"> layers, operationalizing the orchestration tool decision made in ADR-005 (Azure Data Factory). It is intended for engineers building the pipelines in Steps 13–16, and satisfies the reconciliation, error handling, data quality, and POPIA propagation requirements defined in FRD-001 (FR-CCR-005 through FR-CCR-008).</w:t>
       </w:r>
     </w:p>
     <w:p>
@@ -1276,7 +1304,35 @@
         <w:rPr>
           <w:rFonts w:ascii="Calibri" w:hAnsi="Calibri" w:cs="Calibri"/>
         </w:rPr>
-        <w:t xml:space="preserve"> No special Bronze-layer handling is required. The 24–48 hour confirmation lag is a characteristic of these platforms' own APIs, not a pipeline failure — Bronze lands whatever confirmed data each source returns on its normal schedule. The lag is not a Bronze-layer risk; it is a downstream Silver/Gold-layer risk (FactContactHistory's contact-count accuracy against the POPIA 4-contact monthly cap), already addressed via the optimistic-count-plus-breach-alert approach agreed with Priya's team (SSI-001).</w:t>
+        <w:t xml:space="preserve"> No special Bronze-layer handling is required. The 24–</w:t>
+      </w:r>
+      <w:proofErr w:type="gramStart"/>
+      <w:r>
+        <w:rPr>
+          <w:rFonts w:ascii="Calibri" w:hAnsi="Calibri" w:cs="Calibri"/>
+        </w:rPr>
+        <w:t>48 hour</w:t>
+      </w:r>
+      <w:proofErr w:type="gramEnd"/>
+      <w:r>
+        <w:rPr>
+          <w:rFonts w:ascii="Calibri" w:hAnsi="Calibri" w:cs="Calibri"/>
+        </w:rPr>
+        <w:t xml:space="preserve"> confirmation lag is a characteristic of these platforms' own APIs, not a pipeline failure — Bronze lands whatever confirmed data each source returns on its normal schedule. The lag is not a Bronze-layer risk; it is a downstream Silver/Gold-layer risk (</w:t>
+      </w:r>
+      <w:proofErr w:type="spellStart"/>
+      <w:r>
+        <w:rPr>
+          <w:rFonts w:ascii="Calibri" w:hAnsi="Calibri" w:cs="Calibri"/>
+        </w:rPr>
+        <w:t>FactContactHistory's</w:t>
+      </w:r>
+      <w:proofErr w:type="spellEnd"/>
+      <w:r>
+        <w:rPr>
+          <w:rFonts w:ascii="Calibri" w:hAnsi="Calibri" w:cs="Calibri"/>
+        </w:rPr>
+        <w:t xml:space="preserve"> contact-count accuracy against the POPIA 4-contact monthly cap), already addressed via the optimistic-count-plus-breach-alert approach agreed with Priya's team (SSI-001).</w:t>
       </w:r>
     </w:p>
     <w:p>
@@ -1325,7 +1381,25 @@
           <w:i/>
           <w:iCs/>
         </w:rPr>
-        <w:t xml:space="preserve"> ingestion runs on a dedicated schedule of every 4 hours (6 runs/day), distinct from the platform's standard once-nightly batch used elsewhere. This is required specifically to satisfy FR-CUS-008's same-day POPIA breach alert commitment — a once-nightly schedule cannot reliably catch a confirmation that lands at an arbitrary time within the day. All other sources remain on the standard nightly schedule; this exception applies only to Meta and GA4.</w:t>
+        <w:t xml:space="preserve"> ingestion </w:t>
+      </w:r>
+      <w:proofErr w:type="gramStart"/>
+      <w:r>
+        <w:rPr>
+          <w:rFonts w:ascii="Calibri" w:hAnsi="Calibri" w:cs="Calibri"/>
+          <w:i/>
+          <w:iCs/>
+        </w:rPr>
+        <w:t>runs</w:t>
+      </w:r>
+      <w:proofErr w:type="gramEnd"/>
+      <w:r>
+        <w:rPr>
+          <w:rFonts w:ascii="Calibri" w:hAnsi="Calibri" w:cs="Calibri"/>
+          <w:i/>
+          <w:iCs/>
+        </w:rPr>
+        <w:t xml:space="preserve"> on a dedicated schedule of every 4 hours (6 runs/day), distinct from the platform's standard once-nightly batch used elsewhere. This is required specifically to satisfy FR-CUS-008's same-day POPIA breach alert commitment — a once-nightly schedule cannot reliably catch a confirmation that lands at an arbitrary time within the day. All other sources remain on the standard nightly schedule; this exception applies only to Meta and GA4.</w:t>
       </w:r>
     </w:p>
     <w:p>
@@ -1349,7 +1423,21 @@
         <w:rPr>
           <w:rFonts w:ascii="Calibri" w:hAnsi="Calibri" w:cs="Calibri"/>
         </w:rPr>
-        <w:t xml:space="preserve"> Raw PDF files land in Bronze unchanged, consistent with every other source. The pypdf-extraction-and-LLM-structuring pipeline runs as a </w:t>
+        <w:t xml:space="preserve"> Raw PDF files land in Bronze unchanged, consistent with every other source. The </w:t>
+      </w:r>
+      <w:proofErr w:type="spellStart"/>
+      <w:r>
+        <w:rPr>
+          <w:rFonts w:ascii="Calibri" w:hAnsi="Calibri" w:cs="Calibri"/>
+        </w:rPr>
+        <w:t>pypdf</w:t>
+      </w:r>
+      <w:proofErr w:type="spellEnd"/>
+      <w:r>
+        <w:rPr>
+          <w:rFonts w:ascii="Calibri" w:hAnsi="Calibri" w:cs="Calibri"/>
+        </w:rPr>
+        <w:t xml:space="preserve">-extraction-and-LLM-structuring pipeline runs as a </w:t>
       </w:r>
       <w:r>
         <w:rPr>
@@ -1389,7 +1477,35 @@
         <w:rPr>
           <w:rFonts w:ascii="Calibri" w:hAnsi="Calibri" w:cs="Calibri"/>
         </w:rPr>
-        <w:t xml:space="preserve"> Not an ongoing Bronze ingestion source. Per SSI-001's discovery-and-decommission approach, this system is out of scope for DID-001's ongoing pipeline design; its two undocumented reports will be replicated as part of the Legacy DW discovery workstream, independent of the standard Bronze pattern.</w:t>
+        <w:t xml:space="preserve"> Not an ongoing </w:t>
+      </w:r>
+      <w:proofErr w:type="gramStart"/>
+      <w:r>
+        <w:rPr>
+          <w:rFonts w:ascii="Calibri" w:hAnsi="Calibri" w:cs="Calibri"/>
+        </w:rPr>
+        <w:t>Bronze</w:t>
+      </w:r>
+      <w:proofErr w:type="gramEnd"/>
+      <w:r>
+        <w:rPr>
+          <w:rFonts w:ascii="Calibri" w:hAnsi="Calibri" w:cs="Calibri"/>
+        </w:rPr>
+        <w:t xml:space="preserve"> ingestion source. Per SSI-001's discovery-and-decommission approach, this system is out of scope for DID-001's ongoing pipeline design; its two undocumented reports will be replicated as part of the Legacy DW discovery workstream, independent of the standard </w:t>
+      </w:r>
+      <w:proofErr w:type="gramStart"/>
+      <w:r>
+        <w:rPr>
+          <w:rFonts w:ascii="Calibri" w:hAnsi="Calibri" w:cs="Calibri"/>
+        </w:rPr>
+        <w:t>Bronze</w:t>
+      </w:r>
+      <w:proofErr w:type="gramEnd"/>
+      <w:r>
+        <w:rPr>
+          <w:rFonts w:ascii="Calibri" w:hAnsi="Calibri" w:cs="Calibri"/>
+        </w:rPr>
+        <w:t xml:space="preserve"> pattern.</w:t>
       </w:r>
     </w:p>
     <w:p>
@@ -1439,7 +1555,23 @@
           <w:rFonts w:ascii="Calibri" w:hAnsi="Calibri" w:cs="Calibri"/>
           <w:color w:val="1A1A1A"/>
         </w:rPr>
-        <w:t>Silver is where raw Bronze data becomes cleaned, conformed, and trustworthy — cleansing, standardization, and the two identity resolution processes (ADR-001 for Product, ADR-002 for Customer) all happen at this layer.</w:t>
+        <w:t xml:space="preserve">Silver is where raw </w:t>
+      </w:r>
+      <w:proofErr w:type="gramStart"/>
+      <w:r>
+        <w:rPr>
+          <w:rFonts w:ascii="Calibri" w:hAnsi="Calibri" w:cs="Calibri"/>
+          <w:color w:val="1A1A1A"/>
+        </w:rPr>
+        <w:t>Bronze</w:t>
+      </w:r>
+      <w:proofErr w:type="gramEnd"/>
+      <w:r>
+        <w:rPr>
+          <w:rFonts w:ascii="Calibri" w:hAnsi="Calibri" w:cs="Calibri"/>
+          <w:color w:val="1A1A1A"/>
+        </w:rPr>
+        <w:t xml:space="preserve"> data becomes cleaned, conformed, and trustworthy — cleansing, standardization, and the two identity resolution processes (ADR-001 for Product, ADR-002 for Customer) all happen at this layer.</w:t>
       </w:r>
     </w:p>
     <w:p>
@@ -1574,7 +1706,23 @@
           <w:rFonts w:ascii="Calibri" w:hAnsi="Calibri" w:cs="Calibri"/>
           <w:color w:val="1A1A1A"/>
         </w:rPr>
-        <w:t xml:space="preserve"> Every constraint declared as informational-only throughout PDD-001 Section 5 is enforced here via dbt's built-in generic tests — no additional packages required for standard cases:</w:t>
+        <w:t xml:space="preserve"> Every constraint declared as informational-only throughout PDD-001 Section 5 is enforced here via </w:t>
+      </w:r>
+      <w:proofErr w:type="spellStart"/>
+      <w:r>
+        <w:rPr>
+          <w:rFonts w:ascii="Calibri" w:hAnsi="Calibri" w:cs="Calibri"/>
+          <w:color w:val="1A1A1A"/>
+        </w:rPr>
+        <w:t>dbt's</w:t>
+      </w:r>
+      <w:proofErr w:type="spellEnd"/>
+      <w:r>
+        <w:rPr>
+          <w:rFonts w:ascii="Calibri" w:hAnsi="Calibri" w:cs="Calibri"/>
+          <w:color w:val="1A1A1A"/>
+        </w:rPr>
+        <w:t xml:space="preserve"> built-in generic tests — no additional packages required for standard cases:</w:t>
       </w:r>
     </w:p>
     <w:tbl>
@@ -1742,6 +1890,7 @@
                 <w:szCs w:val="19"/>
               </w:rPr>
             </w:pPr>
+            <w:proofErr w:type="spellStart"/>
             <w:r>
               <w:rPr>
                 <w:rFonts w:ascii="Calibri" w:hAnsi="Calibri" w:cs="Calibri"/>
@@ -1753,6 +1902,7 @@
               </w:rPr>
               <w:t>not_null</w:t>
             </w:r>
+            <w:proofErr w:type="spellEnd"/>
             <w:r>
               <w:rPr>
                 <w:rFonts w:ascii="Calibri" w:hAnsi="Calibri" w:cs="Calibri"/>
@@ -1941,6 +2091,7 @@
               </w:rPr>
               <w:t xml:space="preserve"> (composite, e.g. </w:t>
             </w:r>
+            <w:proofErr w:type="spellStart"/>
             <w:r>
               <w:rPr>
                 <w:rFonts w:ascii="Calibri" w:hAnsi="Calibri" w:cs="Calibri"/>
@@ -1950,8 +2101,33 @@
                 <w:sz w:val="19"/>
                 <w:szCs w:val="19"/>
               </w:rPr>
-              <w:t>order_id + line_number</w:t>
+              <w:t>order_id</w:t>
             </w:r>
+            <w:proofErr w:type="spellEnd"/>
+            <w:r>
+              <w:rPr>
+                <w:rFonts w:ascii="Calibri" w:hAnsi="Calibri" w:cs="Calibri"/>
+                <w:b/>
+                <w:bCs/>
+                <w:color w:val="1A1A1A"/>
+                <w:sz w:val="19"/>
+                <w:szCs w:val="19"/>
+              </w:rPr>
+              <w:t xml:space="preserve"> + </w:t>
+            </w:r>
+            <w:proofErr w:type="spellStart"/>
+            <w:r>
+              <w:rPr>
+                <w:rFonts w:ascii="Calibri" w:hAnsi="Calibri" w:cs="Calibri"/>
+                <w:b/>
+                <w:bCs/>
+                <w:color w:val="1A1A1A"/>
+                <w:sz w:val="19"/>
+                <w:szCs w:val="19"/>
+              </w:rPr>
+              <w:t>line_number</w:t>
+            </w:r>
+            <w:proofErr w:type="spellEnd"/>
             <w:r>
               <w:rPr>
                 <w:rFonts w:ascii="Calibri" w:hAnsi="Calibri" w:cs="Calibri"/>
@@ -1981,6 +2157,7 @@
                 <w:szCs w:val="19"/>
               </w:rPr>
             </w:pPr>
+            <w:proofErr w:type="spellStart"/>
             <w:r>
               <w:rPr>
                 <w:rFonts w:ascii="Calibri" w:hAnsi="Calibri" w:cs="Calibri"/>
@@ -1990,8 +2167,33 @@
                 <w:sz w:val="19"/>
                 <w:szCs w:val="19"/>
               </w:rPr>
-              <w:t>dbt_utils.unique_combination_of_columns</w:t>
+              <w:t>dbt_</w:t>
             </w:r>
+            <w:proofErr w:type="gramStart"/>
+            <w:r>
+              <w:rPr>
+                <w:rFonts w:ascii="Calibri" w:hAnsi="Calibri" w:cs="Calibri"/>
+                <w:b/>
+                <w:bCs/>
+                <w:color w:val="1A1A1A"/>
+                <w:sz w:val="19"/>
+                <w:szCs w:val="19"/>
+              </w:rPr>
+              <w:t>utils.unique</w:t>
+            </w:r>
+            <w:proofErr w:type="gramEnd"/>
+            <w:r>
+              <w:rPr>
+                <w:rFonts w:ascii="Calibri" w:hAnsi="Calibri" w:cs="Calibri"/>
+                <w:b/>
+                <w:bCs/>
+                <w:color w:val="1A1A1A"/>
+                <w:sz w:val="19"/>
+                <w:szCs w:val="19"/>
+              </w:rPr>
+              <w:t>_combination_of_columns</w:t>
+            </w:r>
+            <w:proofErr w:type="spellEnd"/>
           </w:p>
         </w:tc>
         <w:tc>
@@ -2039,6 +2241,7 @@
               </w:rPr>
               <w:t xml:space="preserve"> test only checks one column; composite keys need the </w:t>
             </w:r>
+            <w:proofErr w:type="spellStart"/>
             <w:r>
               <w:rPr>
                 <w:rFonts w:ascii="Calibri" w:hAnsi="Calibri" w:cs="Calibri"/>
@@ -2050,6 +2253,7 @@
               </w:rPr>
               <w:t>dbt_utils</w:t>
             </w:r>
+            <w:proofErr w:type="spellEnd"/>
             <w:r>
               <w:rPr>
                 <w:rFonts w:ascii="Calibri" w:hAnsi="Calibri" w:cs="Calibri"/>
@@ -2172,8 +2376,29 @@
                 <w:sz w:val="19"/>
                 <w:szCs w:val="19"/>
               </w:rPr>
-              <w:t>Status/enum columns (</w:t>
+              <w:t>Status/</w:t>
             </w:r>
+            <w:proofErr w:type="spellStart"/>
+            <w:r>
+              <w:rPr>
+                <w:rFonts w:ascii="Calibri" w:hAnsi="Calibri" w:cs="Calibri"/>
+                <w:color w:val="1A1A1A"/>
+                <w:sz w:val="19"/>
+                <w:szCs w:val="19"/>
+              </w:rPr>
+              <w:t>enum</w:t>
+            </w:r>
+            <w:proofErr w:type="spellEnd"/>
+            <w:r>
+              <w:rPr>
+                <w:rFonts w:ascii="Calibri" w:hAnsi="Calibri" w:cs="Calibri"/>
+                <w:color w:val="1A1A1A"/>
+                <w:sz w:val="19"/>
+                <w:szCs w:val="19"/>
+              </w:rPr>
+              <w:t xml:space="preserve"> columns (</w:t>
+            </w:r>
+            <w:proofErr w:type="spellStart"/>
             <w:r>
               <w:rPr>
                 <w:rFonts w:ascii="Calibri" w:hAnsi="Calibri" w:cs="Calibri"/>
@@ -2183,8 +2408,33 @@
                 <w:sz w:val="19"/>
                 <w:szCs w:val="19"/>
               </w:rPr>
-              <w:t>po_status, order_status</w:t>
+              <w:t>po_status</w:t>
             </w:r>
+            <w:proofErr w:type="spellEnd"/>
+            <w:r>
+              <w:rPr>
+                <w:rFonts w:ascii="Calibri" w:hAnsi="Calibri" w:cs="Calibri"/>
+                <w:b/>
+                <w:bCs/>
+                <w:color w:val="1A1A1A"/>
+                <w:sz w:val="19"/>
+                <w:szCs w:val="19"/>
+              </w:rPr>
+              <w:t xml:space="preserve">, </w:t>
+            </w:r>
+            <w:proofErr w:type="spellStart"/>
+            <w:r>
+              <w:rPr>
+                <w:rFonts w:ascii="Calibri" w:hAnsi="Calibri" w:cs="Calibri"/>
+                <w:b/>
+                <w:bCs/>
+                <w:color w:val="1A1A1A"/>
+                <w:sz w:val="19"/>
+                <w:szCs w:val="19"/>
+              </w:rPr>
+              <w:t>order_status</w:t>
+            </w:r>
+            <w:proofErr w:type="spellEnd"/>
             <w:r>
               <w:rPr>
                 <w:rFonts w:ascii="Calibri" w:hAnsi="Calibri" w:cs="Calibri"/>
@@ -2214,6 +2464,7 @@
                 <w:szCs w:val="19"/>
               </w:rPr>
             </w:pPr>
+            <w:proofErr w:type="spellStart"/>
             <w:r>
               <w:rPr>
                 <w:rFonts w:ascii="Calibri" w:hAnsi="Calibri" w:cs="Calibri"/>
@@ -2225,6 +2476,7 @@
               </w:rPr>
               <w:t>accepted_values</w:t>
             </w:r>
+            <w:proofErr w:type="spellEnd"/>
           </w:p>
         </w:tc>
         <w:tc>
@@ -2320,7 +2572,47 @@
           <w:iCs/>
           <w:color w:val="1A1A1A"/>
         </w:rPr>
-        <w:t>This transformation differs structurally from the rest of Silver. Standard Silver transformations (cleansing, standardization, identity resolution) apply consistent, repeatable logic to structured Bronze data — dbt tests reliably catch their failure modes (NULLs, duplicates, out-of-range values). The pypdf+LLM extraction step applies an LLM to unstructured text on a one-off or on-request basis (new/amended contracts only, not a nightly recurring transform), and its dominant risk is different: a confidently wrong extraction (e.g. a misread contracted rate) that is structurally valid and will pass every standard dbt test, since nothing about it looks malformed. Standard data quality gates cannot catch this failure mode. Mitigating this requires a human spot-check step against source PDFs — sampling extracted values against the original document — rather than relying on automated testing alone. This is a build-phase (Step 14) design detail to resolve before this pipeline goes live, and it remains linked to ADR-003's own outstanding sign-off (Sipho Dlamini, per DM-001's outstanding items).</w:t>
+        <w:t xml:space="preserve">This transformation differs structurally from the rest of Silver. Standard Silver transformations (cleansing, standardization, identity resolution) apply consistent, repeatable logic to structured </w:t>
+      </w:r>
+      <w:proofErr w:type="gramStart"/>
+      <w:r>
+        <w:rPr>
+          <w:rFonts w:ascii="Calibri" w:hAnsi="Calibri" w:cs="Calibri"/>
+          <w:i/>
+          <w:iCs/>
+          <w:color w:val="1A1A1A"/>
+        </w:rPr>
+        <w:t>Bronze</w:t>
+      </w:r>
+      <w:proofErr w:type="gramEnd"/>
+      <w:r>
+        <w:rPr>
+          <w:rFonts w:ascii="Calibri" w:hAnsi="Calibri" w:cs="Calibri"/>
+          <w:i/>
+          <w:iCs/>
+          <w:color w:val="1A1A1A"/>
+        </w:rPr>
+        <w:t xml:space="preserve"> data — dbt tests reliably catch their failure modes (NULLs, duplicates, out-of-range values). The </w:t>
+      </w:r>
+      <w:proofErr w:type="spellStart"/>
+      <w:r>
+        <w:rPr>
+          <w:rFonts w:ascii="Calibri" w:hAnsi="Calibri" w:cs="Calibri"/>
+          <w:i/>
+          <w:iCs/>
+          <w:color w:val="1A1A1A"/>
+        </w:rPr>
+        <w:t>pypdf+LLM</w:t>
+      </w:r>
+      <w:proofErr w:type="spellEnd"/>
+      <w:r>
+        <w:rPr>
+          <w:rFonts w:ascii="Calibri" w:hAnsi="Calibri" w:cs="Calibri"/>
+          <w:i/>
+          <w:iCs/>
+          <w:color w:val="1A1A1A"/>
+        </w:rPr>
+        <w:t xml:space="preserve"> extraction step applies an LLM to unstructured text on a one-off or on-request basis (new/amended contracts only, not a nightly recurring transform), and its dominant risk is different: a confidently wrong extraction (e.g. a misread contracted rate) that is structurally valid and will pass every standard dbt test, since nothing about it looks malformed. Standard data quality gates cannot catch this failure mode. Mitigating this requires a human spot-check step against source PDFs — sampling extracted values against the original document — rather than relying on automated testing alone. This is a build-phase (Step 14) design detail to resolve before this pipeline goes live, and it remains linked to ADR-003's own outstanding sign-off (Sipho Dlamini, per DM-001's outstanding items).</w:t>
       </w:r>
     </w:p>
     <w:p>
@@ -2517,7 +2809,21 @@
         <w:rPr>
           <w:rFonts w:ascii="Calibri" w:hAnsi="Calibri" w:cs="Calibri"/>
         </w:rPr>
-        <w:t xml:space="preserve"> (FactSales, FactFinance, FactInventorySnapshot) use a plain INSERT. Each row is created once and never revisited — there are no lifecycle or status columns for a later run to update. Protection against accidental duplicate loads (e.g. a pipeline rerun after a partial failure) is provided by the same dbt uniqueness tests declared in Section 4 (unique_combination_of_columns on each table's degenerate identifier or grain columns), not by the load mechanism itself. A duplicate load fails the pipeline via FR-CCR-007's test gate rather than being silently prevented at insert time.</w:t>
+        <w:t xml:space="preserve"> (FactSales, FactFinance, FactInventorySnapshot) use a plain INSERT. Each row is created once and never revisited — there are no lifecycle or status columns for a later run to update. Protection against accidental duplicate loads (e.g. a pipeline rerun after a partial failure) is provided by the same dbt uniqueness tests declared in Section 4 (</w:t>
+      </w:r>
+      <w:proofErr w:type="spellStart"/>
+      <w:r>
+        <w:rPr>
+          <w:rFonts w:ascii="Calibri" w:hAnsi="Calibri" w:cs="Calibri"/>
+        </w:rPr>
+        <w:t>unique_combination_of_columns</w:t>
+      </w:r>
+      <w:proofErr w:type="spellEnd"/>
+      <w:r>
+        <w:rPr>
+          <w:rFonts w:ascii="Calibri" w:hAnsi="Calibri" w:cs="Calibri"/>
+        </w:rPr>
+        <w:t xml:space="preserve"> on each table's degenerate identifier or grain columns), not by the load mechanism itself. A duplicate load fails the pipeline via FR-CCR-007's test gate rather than being silently prevented at insert time.</w:t>
       </w:r>
     </w:p>
     <w:p>
@@ -2609,7 +2915,21 @@
         <w:rPr>
           <w:rFonts w:ascii="Calibri" w:hAnsi="Calibri" w:cs="Calibri"/>
         </w:rPr>
-        <w:t xml:space="preserve"> be overwritten — doing so would silently rewrite history for every fact row that referenced it. Instead, loading requires two steps: first, the existing current row is closed out (is_current = 0, effective_end_date set); second, a new row is inserted with the updated attribute values (is_current = 1, effective_start_date set, effective_end_date defaulted forward). A single MERGE cannot both update and insert against the same matched row, so this is implemented as two coordinated statements, not one. In practice, this pattern is commonly automated using dbt's built-in </w:t>
+        <w:t xml:space="preserve"> be overwritten — doing so would silently rewrite history for every fact row that referenced it. Instead, loading requires two steps: first, the existing current row is closed out (is_current = 0, effective_end_date set); second, a new row is inserted with the updated attribute values (is_current = 1, effective_start_date set, effective_end_date defaulted forward). A single MERGE cannot both update and insert against the same matched row, so this is implemented as two coordinated statements, not one. In practice, this pattern is commonly automated using </w:t>
+      </w:r>
+      <w:proofErr w:type="spellStart"/>
+      <w:r>
+        <w:rPr>
+          <w:rFonts w:ascii="Calibri" w:hAnsi="Calibri" w:cs="Calibri"/>
+        </w:rPr>
+        <w:t>dbt's</w:t>
+      </w:r>
+      <w:proofErr w:type="spellEnd"/>
+      <w:r>
+        <w:rPr>
+          <w:rFonts w:ascii="Calibri" w:hAnsi="Calibri" w:cs="Calibri"/>
+        </w:rPr>
+        <w:t xml:space="preserve"> built-in </w:t>
       </w:r>
       <w:r>
         <w:rPr>
@@ -2681,7 +3001,21 @@
         <w:rPr>
           <w:rFonts w:ascii="Calibri" w:hAnsi="Calibri" w:cs="Calibri"/>
         </w:rPr>
-        <w:t xml:space="preserve"> (DimDate, DimChannel): no ongoing extraction pipeline. DimDate is generated once as a full calendar range at platform setup; DimChannel (~7 rows) is manually maintained and updated only when a new channel is introduced. Neither requires a scheduled Gold load job.</w:t>
+        <w:t xml:space="preserve"> (DimDate, DimChannel): no ongoing extraction pipeline. DimDate is generated once as a full calendar range at platform setup; DimChannel (~7 rows) is manually maintained and updated only when a new channel is introduced. Neither requires a scheduled </w:t>
+      </w:r>
+      <w:proofErr w:type="gramStart"/>
+      <w:r>
+        <w:rPr>
+          <w:rFonts w:ascii="Calibri" w:hAnsi="Calibri" w:cs="Calibri"/>
+        </w:rPr>
+        <w:t>Gold</w:t>
+      </w:r>
+      <w:proofErr w:type="gramEnd"/>
+      <w:r>
+        <w:rPr>
+          <w:rFonts w:ascii="Calibri" w:hAnsi="Calibri" w:cs="Calibri"/>
+        </w:rPr>
+        <w:t xml:space="preserve"> load job.</w:t>
       </w:r>
     </w:p>
     <w:p>
@@ -3041,7 +3375,35 @@
         <w:rPr>
           <w:rFonts w:ascii="Calibri" w:hAnsi="Calibri" w:cs="Calibri"/>
         </w:rPr>
-        <w:t>Method varies by table type, not row counts alone:</w:t>
+        <w:t xml:space="preserve">Reconciliation runs at each layer boundary. </w:t>
+      </w:r>
+      <w:r>
+        <w:rPr>
+          <w:rFonts w:ascii="Calibri" w:hAnsi="Calibri" w:cs="Calibri"/>
+          <w:b/>
+          <w:bCs/>
+        </w:rPr>
+        <w:t>Bronze to Silver:</w:t>
+      </w:r>
+      <w:r>
+        <w:rPr>
+          <w:rFonts w:ascii="Calibri" w:hAnsi="Calibri" w:cs="Calibri"/>
+        </w:rPr>
+        <w:t xml:space="preserve"> Bronze count = Silver count + logged rejected rows (rejected rows are written to a reject table with a reason, never dropped silently). </w:t>
+      </w:r>
+      <w:r>
+        <w:rPr>
+          <w:rFonts w:ascii="Calibri" w:hAnsi="Calibri" w:cs="Calibri"/>
+          <w:b/>
+          <w:bCs/>
+        </w:rPr>
+        <w:t>Silver to Gold:</w:t>
+      </w:r>
+      <w:r>
+        <w:rPr>
+          <w:rFonts w:ascii="Calibri" w:hAnsi="Calibri" w:cs="Calibri"/>
+        </w:rPr>
+        <w:t xml:space="preserve"> the method varies by table type, not row counts alone:</w:t>
       </w:r>
     </w:p>
     <w:p>
@@ -3071,7 +3433,37 @@
         <w:rPr>
           <w:rFonts w:ascii="Calibri" w:hAnsi="Calibri" w:cs="Calibri"/>
         </w:rPr>
-        <w:t xml:space="preserve"> (FactSales, FactInventorySnapshot): row-count reconciliation between Bronze and Gold is a valid first check, since each Bronze extract corresponds to exactly one Gold row.</w:t>
+        <w:t xml:space="preserve"> (FactSales, FactInventorySnapshot): row-count reconciliation </w:t>
+      </w:r>
+      <w:r>
+        <w:rPr>
+          <w:rFonts w:ascii="Calibri" w:hAnsi="Calibri" w:cs="Calibri"/>
+        </w:rPr>
+        <w:t>between Silver and Gold</w:t>
+      </w:r>
+      <w:r>
+        <w:rPr>
+          <w:rFonts w:ascii="Calibri" w:hAnsi="Calibri" w:cs="Calibri"/>
+        </w:rPr>
+        <w:t xml:space="preserve"> </w:t>
+      </w:r>
+      <w:r>
+        <w:rPr>
+          <w:rFonts w:ascii="Calibri" w:hAnsi="Calibri" w:cs="Calibri"/>
+        </w:rPr>
+        <w:t xml:space="preserve">is a valid first check, since </w:t>
+      </w:r>
+      <w:r>
+        <w:rPr>
+          <w:rFonts w:ascii="Calibri" w:hAnsi="Calibri" w:cs="Calibri"/>
+        </w:rPr>
+        <w:t>each Silver row loads to exactly one Gold row</w:t>
+      </w:r>
+      <w:r>
+        <w:rPr>
+          <w:rFonts w:ascii="Calibri" w:hAnsi="Calibri" w:cs="Calibri"/>
+        </w:rPr>
+        <w:t>.</w:t>
       </w:r>
     </w:p>
     <w:p>
@@ -3117,6 +3509,7 @@
         </w:rPr>
         <w:t xml:space="preserve"> — e.g. sum of </w:t>
       </w:r>
+      <w:proofErr w:type="spellStart"/>
       <w:r>
         <w:rPr>
           <w:rFonts w:ascii="Calibri" w:hAnsi="Calibri" w:cs="Calibri"/>
@@ -3125,12 +3518,26 @@
         </w:rPr>
         <w:t>debit_amount</w:t>
       </w:r>
-      <w:r>
-        <w:rPr>
-          <w:rFonts w:ascii="Calibri" w:hAnsi="Calibri" w:cs="Calibri"/>
-        </w:rPr>
-        <w:t xml:space="preserve"> in Bronze versus sum of </w:t>
-      </w:r>
+      <w:proofErr w:type="spellEnd"/>
+      <w:r>
+        <w:rPr>
+          <w:rFonts w:ascii="Calibri" w:hAnsi="Calibri" w:cs="Calibri"/>
+        </w:rPr>
+        <w:t xml:space="preserve"> in </w:t>
+      </w:r>
+      <w:r>
+        <w:rPr>
+          <w:rFonts w:ascii="Calibri" w:hAnsi="Calibri" w:cs="Calibri"/>
+        </w:rPr>
+        <w:t>Silver</w:t>
+      </w:r>
+      <w:r>
+        <w:rPr>
+          <w:rFonts w:ascii="Calibri" w:hAnsi="Calibri" w:cs="Calibri"/>
+        </w:rPr>
+        <w:t xml:space="preserve"> versus sum of </w:t>
+      </w:r>
+      <w:proofErr w:type="spellStart"/>
       <w:r>
         <w:rPr>
           <w:rFonts w:ascii="Calibri" w:hAnsi="Calibri" w:cs="Calibri"/>
@@ -3139,6 +3546,7 @@
         </w:rPr>
         <w:t>debit_amount</w:t>
       </w:r>
+      <w:proofErr w:type="spellEnd"/>
       <w:r>
         <w:rPr>
           <w:rFonts w:ascii="Calibri" w:hAnsi="Calibri" w:cs="Calibri"/>
@@ -3173,7 +3581,35 @@
         <w:rPr>
           <w:rFonts w:ascii="Calibri" w:hAnsi="Calibri" w:cs="Calibri"/>
         </w:rPr>
-        <w:t xml:space="preserve"> (FactReplenishment, FactProcurement, FactContactHistory, FactSupplierContract): row-count reconciliation is not meaningful here — a single business key (e.g. one purchase order) may generate multiple Bronze extracts across its lifecycle but only one current Gold row. Reconciliation instead confirms that Gold's current state matches the </w:t>
+        <w:t xml:space="preserve"> (FactReplenishment, FactProcurement, FactContactHistory, FactSupplierContract): row-count reconciliation is not meaningful here — a single business key (e.g. one purchase order) may generate multiple </w:t>
+      </w:r>
+      <w:proofErr w:type="gramStart"/>
+      <w:r>
+        <w:rPr>
+          <w:rFonts w:ascii="Calibri" w:hAnsi="Calibri" w:cs="Calibri"/>
+        </w:rPr>
+        <w:t>Bronze</w:t>
+      </w:r>
+      <w:proofErr w:type="gramEnd"/>
+      <w:r>
+        <w:rPr>
+          <w:rFonts w:ascii="Calibri" w:hAnsi="Calibri" w:cs="Calibri"/>
+        </w:rPr>
+        <w:t xml:space="preserve"> extracts across its lifecycle but only one current </w:t>
+      </w:r>
+      <w:proofErr w:type="gramStart"/>
+      <w:r>
+        <w:rPr>
+          <w:rFonts w:ascii="Calibri" w:hAnsi="Calibri" w:cs="Calibri"/>
+        </w:rPr>
+        <w:t>Gold</w:t>
+      </w:r>
+      <w:proofErr w:type="gramEnd"/>
+      <w:r>
+        <w:rPr>
+          <w:rFonts w:ascii="Calibri" w:hAnsi="Calibri" w:cs="Calibri"/>
+        </w:rPr>
+        <w:t xml:space="preserve"> row. Reconciliation instead confirms that Gold's current state matches the </w:t>
       </w:r>
       <w:r>
         <w:rPr>
@@ -3181,22 +3617,42 @@
           <w:b/>
           <w:bCs/>
         </w:rPr>
-        <w:t>most recent</w:t>
-      </w:r>
-      <w:r>
-        <w:rPr>
-          <w:rFonts w:ascii="Calibri" w:hAnsi="Calibri" w:cs="Calibri"/>
-        </w:rPr>
-        <w:t xml:space="preserve"> Bronze extract per business key, validated via control totals (e.g. sum of </w:t>
-      </w:r>
+        <w:t xml:space="preserve">most recent </w:t>
+      </w:r>
+      <w:proofErr w:type="gramStart"/>
       <w:r>
         <w:rPr>
           <w:rFonts w:ascii="Calibri" w:hAnsi="Calibri" w:cs="Calibri"/>
           <w:b/>
           <w:bCs/>
         </w:rPr>
+        <w:t>Silver</w:t>
+      </w:r>
+      <w:proofErr w:type="gramEnd"/>
+      <w:r>
+        <w:rPr>
+          <w:rFonts w:ascii="Calibri" w:hAnsi="Calibri" w:cs="Calibri"/>
+          <w:b/>
+          <w:bCs/>
+        </w:rPr>
+        <w:t xml:space="preserve"> state per business key</w:t>
+      </w:r>
+      <w:r>
+        <w:rPr>
+          <w:rFonts w:ascii="Calibri" w:hAnsi="Calibri" w:cs="Calibri"/>
+        </w:rPr>
+        <w:t xml:space="preserve">, validated via control totals (e.g. sum of </w:t>
+      </w:r>
+      <w:proofErr w:type="spellStart"/>
+      <w:r>
+        <w:rPr>
+          <w:rFonts w:ascii="Calibri" w:hAnsi="Calibri" w:cs="Calibri"/>
+          <w:b/>
+          <w:bCs/>
+        </w:rPr>
         <w:t>total_order_value</w:t>
       </w:r>
+      <w:proofErr w:type="spellEnd"/>
       <w:r>
         <w:rPr>
           <w:rFonts w:ascii="Calibri" w:hAnsi="Calibri" w:cs="Calibri"/>
@@ -3225,7 +3681,28 @@
         <w:rPr>
           <w:rFonts w:ascii="Calibri" w:hAnsi="Calibri" w:cs="Calibri"/>
         </w:rPr>
-        <w:t xml:space="preserve"> Each of the six business domains runs as an independently orchestrated ADF pipeline. A reconciliation failure halts only the affected domain's Gold load — it does not stop the platform's other five domains from loading normally. This contains the blast radius of any single failure and allows unaffected domains' reporting to continue while the failing domain is investigated.</w:t>
+        <w:t xml:space="preserve"> Each of the six business domains runs as an independently orchestrated ADF pipeline. A reconciliation failure halts only the affected domain's </w:t>
+      </w:r>
+      <w:proofErr w:type="gramStart"/>
+      <w:r>
+        <w:rPr>
+          <w:rFonts w:ascii="Calibri" w:hAnsi="Calibri" w:cs="Calibri"/>
+        </w:rPr>
+        <w:t>Gold</w:t>
+      </w:r>
+      <w:proofErr w:type="gramEnd"/>
+      <w:r>
+        <w:rPr>
+          <w:rFonts w:ascii="Calibri" w:hAnsi="Calibri" w:cs="Calibri"/>
+        </w:rPr>
+        <w:t xml:space="preserve"> load — it does not stop the platform's other five domains </w:t>
+      </w:r>
+      <w:r>
+        <w:rPr>
+          <w:rFonts w:ascii="Calibri" w:hAnsi="Calibri" w:cs="Calibri"/>
+        </w:rPr>
+        <w:lastRenderedPageBreak/>
+        <w:t>from loading normally. This contains the blast radius of any single failure and allows unaffected domains' reporting to continue while the failing domain is investigated.</w:t>
       </w:r>
     </w:p>
     <w:p>
@@ -3243,7 +3720,6 @@
           <w:b/>
           <w:bCs/>
         </w:rPr>
-        <w:lastRenderedPageBreak/>
         <w:t>Variance reporting:</w:t>
       </w:r>
       <w:r>
@@ -3383,7 +3859,21 @@
         <w:rPr>
           <w:rFonts w:ascii="Calibri" w:hAnsi="Calibri" w:cs="Calibri"/>
         </w:rPr>
-        <w:t xml:space="preserve"> An opt-out can originate in any of the four systems — a Marketing Cloud unsubscribe link, a Salesforce CRM call center entry, a Meta ad preference change, or a GA4/website preference update. Rather than tracking origin and propagating only to the remaining three, the pipeline checks all four systems for new opt-out events and writes the opt-out status to all four — including the system where it originated — guaranteeing consistency without requiring origin-detection logic.</w:t>
+        <w:t xml:space="preserve"> An opt-out can originate in any of the four systems — a Marketing Cloud unsubscribe link, a Salesforce CRM call </w:t>
+      </w:r>
+      <w:proofErr w:type="spellStart"/>
+      <w:r>
+        <w:rPr>
+          <w:rFonts w:ascii="Calibri" w:hAnsi="Calibri" w:cs="Calibri"/>
+        </w:rPr>
+        <w:t>center</w:t>
+      </w:r>
+      <w:proofErr w:type="spellEnd"/>
+      <w:r>
+        <w:rPr>
+          <w:rFonts w:ascii="Calibri" w:hAnsi="Calibri" w:cs="Calibri"/>
+        </w:rPr>
+        <w:t xml:space="preserve"> entry, a Meta ad preference change, or a GA4/website preference update. Rather than tracking origin and propagating only to the remaining three, the pipeline checks all four systems for new opt-out events and writes the opt-out status to all four — including the system where it originated — guaranteeing consistency without requiring origin-detection logic.</w:t>
       </w:r>
     </w:p>
     <w:p>
@@ -3528,7 +4018,14 @@
         <w:rPr>
           <w:rFonts w:ascii="Calibri" w:hAnsi="Calibri" w:cs="Calibri"/>
         </w:rPr>
-        <w:t xml:space="preserve"> — serves as the first-glance signal of platform health. Anything less than 6/6 triggers investigation into which specific domain failed and why, using ADF's native run history and the Section 6 alerting/runbook process to diagnose. This keeps the daily check simple and unambiguous: a partial success is still treated as requiring attention, not silently accepted as "mostly fine."</w:t>
+        <w:t xml:space="preserve"> — serves as the first-glance signal of platform health. Anything less than 6/6 triggers investigation into which specific domain failed and why, using ADF's </w:t>
+      </w:r>
+      <w:r>
+        <w:rPr>
+          <w:rFonts w:ascii="Calibri" w:hAnsi="Calibri" w:cs="Calibri"/>
+        </w:rPr>
+        <w:lastRenderedPageBreak/>
+        <w:t>native run history and the Section 6 alerting/runbook process to diagnose. This keeps the daily check simple and unambiguous: a partial success is still treated as requiring attention, not silently accepted as "mostly fine."</w:t>
       </w:r>
     </w:p>
     <w:p>
@@ -3545,7 +4042,6 @@
         <w:rPr>
           <w:rFonts w:ascii="Calibri" w:hAnsi="Calibri" w:cs="Calibri"/>
         </w:rPr>
-        <w:lastRenderedPageBreak/>
         <w:t>Note: this is a v1.0 baseline using native tooling only. As the platform matures past initial build (Steps 13+), a consolidated dashboard surfacing the 6/6 metric alongside reconciliation variance (Section 7) and alert volume (Section 6) may be worth building — flagged as a future enhancement, not a Step 10 design requirement.</w:t>
       </w:r>
     </w:p>
@@ -3902,7 +4398,25 @@
           <w:b/>
           <w:bCs/>
         </w:rPr>
-        <w:t>PDF extraction spot-check process</w:t>
+        <w:t xml:space="preserve">PDF extraction </w:t>
+      </w:r>
+      <w:proofErr w:type="gramStart"/>
+      <w:r>
+        <w:rPr>
+          <w:rFonts w:ascii="Calibri" w:hAnsi="Calibri" w:cs="Calibri"/>
+          <w:b/>
+          <w:bCs/>
+        </w:rPr>
+        <w:t>spot-check</w:t>
+      </w:r>
+      <w:proofErr w:type="gramEnd"/>
+      <w:r>
+        <w:rPr>
+          <w:rFonts w:ascii="Calibri" w:hAnsi="Calibri" w:cs="Calibri"/>
+          <w:b/>
+          <w:bCs/>
+        </w:rPr>
+        <w:t xml:space="preserve"> process</w:t>
       </w:r>
       <w:r>
         <w:rPr>
@@ -4425,6 +4939,108 @@
           </w:p>
         </w:tc>
       </w:tr>
+      <w:tr>
+        <w:tc>
+          <w:tcPr>
+            <w:tcW w:w="1134" w:type="dxa"/>
+            <w:shd w:val="clear" w:color="auto" w:fill="F0FDF4"/>
+          </w:tcPr>
+          <w:p>
+            <w:pPr>
+              <w:rPr>
+                <w:rFonts w:ascii="Calibri" w:hAnsi="Calibri" w:cs="Calibri"/>
+                <w:color w:val="166534"/>
+                <w:sz w:val="20"/>
+                <w:szCs w:val="20"/>
+              </w:rPr>
+            </w:pPr>
+            <w:r>
+              <w:rPr>
+                <w:rFonts w:ascii="Calibri" w:hAnsi="Calibri" w:cs="Calibri"/>
+                <w:color w:val="166534"/>
+                <w:sz w:val="20"/>
+                <w:szCs w:val="20"/>
+              </w:rPr>
+              <w:t>1.1</w:t>
+            </w:r>
+          </w:p>
+        </w:tc>
+        <w:tc>
+          <w:tcPr>
+            <w:tcW w:w="1701" w:type="dxa"/>
+            <w:shd w:val="clear" w:color="auto" w:fill="F0FDF4"/>
+          </w:tcPr>
+          <w:p>
+            <w:pPr>
+              <w:rPr>
+                <w:rFonts w:ascii="Calibri" w:hAnsi="Calibri" w:cs="Calibri"/>
+                <w:color w:val="166534"/>
+                <w:sz w:val="20"/>
+                <w:szCs w:val="20"/>
+              </w:rPr>
+            </w:pPr>
+            <w:r>
+              <w:rPr>
+                <w:rFonts w:ascii="Calibri" w:hAnsi="Calibri" w:cs="Calibri"/>
+                <w:color w:val="166534"/>
+                <w:sz w:val="20"/>
+                <w:szCs w:val="20"/>
+              </w:rPr>
+              <w:t>4 October 2026</w:t>
+            </w:r>
+          </w:p>
+        </w:tc>
+        <w:tc>
+          <w:tcPr>
+            <w:tcW w:w="2268" w:type="dxa"/>
+            <w:shd w:val="clear" w:color="auto" w:fill="F0FDF4"/>
+          </w:tcPr>
+          <w:p>
+            <w:pPr>
+              <w:rPr>
+                <w:rFonts w:ascii="Calibri" w:hAnsi="Calibri" w:cs="Calibri"/>
+                <w:color w:val="166534"/>
+                <w:sz w:val="20"/>
+                <w:szCs w:val="20"/>
+              </w:rPr>
+            </w:pPr>
+            <w:r>
+              <w:rPr>
+                <w:rFonts w:ascii="Calibri" w:hAnsi="Calibri" w:cs="Calibri"/>
+                <w:color w:val="166534"/>
+                <w:sz w:val="20"/>
+                <w:szCs w:val="20"/>
+              </w:rPr>
+              <w:t>Thozamile Mbalo</w:t>
+            </w:r>
+          </w:p>
+        </w:tc>
+        <w:tc>
+          <w:tcPr>
+            <w:tcW w:w="3969" w:type="dxa"/>
+            <w:shd w:val="clear" w:color="auto" w:fill="F0FDF4"/>
+          </w:tcPr>
+          <w:p>
+            <w:pPr>
+              <w:rPr>
+                <w:rFonts w:ascii="Calibri" w:hAnsi="Calibri" w:cs="Calibri"/>
+                <w:color w:val="166534"/>
+                <w:sz w:val="20"/>
+                <w:szCs w:val="20"/>
+              </w:rPr>
+            </w:pPr>
+            <w:r>
+              <w:rPr>
+                <w:rFonts w:ascii="Calibri" w:hAnsi="Calibri" w:cs="Calibri"/>
+                <w:color w:val="166534"/>
+                <w:sz w:val="20"/>
+                <w:szCs w:val="20"/>
+              </w:rPr>
+              <w:t>Section 7 aligned with FR-CCR-005: reconciliation now explicitly covers Bronze to Silver as well as Silver to Gold, with legitimately rejected rows accounted for via a logged reject table.</w:t>
+            </w:r>
+          </w:p>
+        </w:tc>
+      </w:tr>
     </w:tbl>
     <w:p>
       <w:pPr>
@@ -4863,7 +5479,16 @@
         <w:sz w:val="16"/>
         <w:szCs w:val="16"/>
       </w:rPr>
-      <w:t>-001 v1.0</w:t>
+      <w:t>-001 v1.</w:t>
+    </w:r>
+    <w:r>
+      <w:rPr>
+        <w:rFonts w:ascii="Calibri" w:hAnsi="Calibri" w:cs="Calibri"/>
+        <w:color w:val="555555"/>
+        <w:sz w:val="16"/>
+        <w:szCs w:val="16"/>
+      </w:rPr>
+      <w:t>1</w:t>
     </w:r>
   </w:p>
 </w:hdr>

</xml_diff>